<commit_message>
feat: Versão com langGraph completo
</commit_message>
<xml_diff>
--- a/data/relatorio_01_E3.docx
+++ b/data/relatorio_01_E3.docx
@@ -527,7 +527,7 @@
         <w:rPr>
           <w:sz w:val="20"/>
         </w:rPr>
-        <w:t>ODS 5 – Igualdade de gênero</w:t>
+        <w:t>ODS 5 – Equality of gênero</w:t>
       </w:r>
     </w:p>
     <w:p>
@@ -1793,7 +1793,7 @@
     </w:p>
     <w:p>
       <w:r>
-        <w:t>Durante o periodo de referencia, o projeto Alfabetização Científica para Crianças do Ensino Fundamental executou 5 atividades, impactando aproximadamente 349 participantes externos. As acoes foram desenvolvidas em parceria com escolas publicas e organizacoes comunitarias, mantendo registro sistematico de todas as etapas.</w:t>
+        <w:t>During o periodo de referencia, o projeto Alfabetização Científica para Crianças do Ensino Fundamental executou 5 atividades, impactando aproximadamente 349 participantes externos. As acoes foram desenvolvidas em parceria com escolas publicas e organizacoes comunitarias, mantendo registro sistematico de todas as etapas.</w:t>
       </w:r>
     </w:p>
     <w:p/>

</xml_diff>